<commit_message>
docs: update Enterprise Data Readiness learner and facilitator materials
Co-authored-by: Copilot <223556219+Copilot@users.noreply.github.com>
</commit_message>
<xml_diff>
--- a/Professional_AI_Training/Business_AI/Enterprise Data Readiness for AI/03 Learner Materials/Participant Workbook.docx
+++ b/Professional_AI_Training/Business_AI/Enterprise Data Readiness for AI/03 Learner Materials/Participant Workbook.docx
@@ -3062,28 +3062,6 @@
           </w:p>
         </w:tc>
       </w:tr>
-      <w:tr>
-        <w:trPr>
-          <w:cantSplit/>
-          <w:trHeight w:val="400" w:hRule="exact"/>
-        </w:trPr>
-        <w:tc>
-          <w:tcPr>
-            <w:tcW w:type="dxa" w:w="9098"/>
-            <w:tcBorders>
-              <w:top w:val="none" w:color="FFFFFF" w:sz="0"/>
-              <w:left w:val="none" w:color="FFFFFF" w:sz="0"/>
-              <w:bottom w:val="single" w:color="C9C5BC" w:sz="4"/>
-              <w:right w:val="none" w:color="FFFFFF" w:sz="0"/>
-            </w:tcBorders>
-          </w:tcPr>
-          <w:p>
-            <w:pPr>
-              <w:spacing w:after="0"/>
-            </w:pPr>
-          </w:p>
-        </w:tc>
-      </w:tr>
     </w:tbl>
     <w:p>
       <w:pPr>
@@ -3173,28 +3151,6 @@
           </w:p>
         </w:tc>
       </w:tr>
-      <w:tr>
-        <w:trPr>
-          <w:cantSplit/>
-          <w:trHeight w:val="400" w:hRule="exact"/>
-        </w:trPr>
-        <w:tc>
-          <w:tcPr>
-            <w:tcW w:type="dxa" w:w="9098"/>
-            <w:tcBorders>
-              <w:top w:val="none" w:color="FFFFFF" w:sz="0"/>
-              <w:left w:val="none" w:color="FFFFFF" w:sz="0"/>
-              <w:bottom w:val="single" w:color="C9C5BC" w:sz="4"/>
-              <w:right w:val="none" w:color="FFFFFF" w:sz="0"/>
-            </w:tcBorders>
-          </w:tcPr>
-          <w:p>
-            <w:pPr>
-              <w:spacing w:after="0"/>
-            </w:pPr>
-          </w:p>
-        </w:tc>
-      </w:tr>
     </w:tbl>
     <w:p>
       <w:pPr>
@@ -3284,28 +3240,6 @@
           </w:p>
         </w:tc>
       </w:tr>
-      <w:tr>
-        <w:trPr>
-          <w:cantSplit/>
-          <w:trHeight w:val="400" w:hRule="exact"/>
-        </w:trPr>
-        <w:tc>
-          <w:tcPr>
-            <w:tcW w:type="dxa" w:w="9098"/>
-            <w:tcBorders>
-              <w:top w:val="none" w:color="FFFFFF" w:sz="0"/>
-              <w:left w:val="none" w:color="FFFFFF" w:sz="0"/>
-              <w:bottom w:val="single" w:color="C9C5BC" w:sz="4"/>
-              <w:right w:val="none" w:color="FFFFFF" w:sz="0"/>
-            </w:tcBorders>
-          </w:tcPr>
-          <w:p>
-            <w:pPr>
-              <w:spacing w:after="0"/>
-            </w:pPr>
-          </w:p>
-        </w:tc>
-      </w:tr>
     </w:tbl>
     <w:p>
       <w:pPr>
@@ -3395,28 +3329,6 @@
           </w:p>
         </w:tc>
       </w:tr>
-      <w:tr>
-        <w:trPr>
-          <w:cantSplit/>
-          <w:trHeight w:val="400" w:hRule="exact"/>
-        </w:trPr>
-        <w:tc>
-          <w:tcPr>
-            <w:tcW w:type="dxa" w:w="9098"/>
-            <w:tcBorders>
-              <w:top w:val="none" w:color="FFFFFF" w:sz="0"/>
-              <w:left w:val="none" w:color="FFFFFF" w:sz="0"/>
-              <w:bottom w:val="single" w:color="C9C5BC" w:sz="4"/>
-              <w:right w:val="none" w:color="FFFFFF" w:sz="0"/>
-            </w:tcBorders>
-          </w:tcPr>
-          <w:p>
-            <w:pPr>
-              <w:spacing w:after="0"/>
-            </w:pPr>
-          </w:p>
-        </w:tc>
-      </w:tr>
     </w:tbl>
     <w:p>
       <w:pPr>
@@ -3506,28 +3418,6 @@
           </w:p>
         </w:tc>
       </w:tr>
-      <w:tr>
-        <w:trPr>
-          <w:cantSplit/>
-          <w:trHeight w:val="400" w:hRule="exact"/>
-        </w:trPr>
-        <w:tc>
-          <w:tcPr>
-            <w:tcW w:type="dxa" w:w="9098"/>
-            <w:tcBorders>
-              <w:top w:val="none" w:color="FFFFFF" w:sz="0"/>
-              <w:left w:val="none" w:color="FFFFFF" w:sz="0"/>
-              <w:bottom w:val="single" w:color="C9C5BC" w:sz="4"/>
-              <w:right w:val="none" w:color="FFFFFF" w:sz="0"/>
-            </w:tcBorders>
-          </w:tcPr>
-          <w:p>
-            <w:pPr>
-              <w:spacing w:after="0"/>
-            </w:pPr>
-          </w:p>
-        </w:tc>
-      </w:tr>
     </w:tbl>
     <w:p>
       <w:pPr>
@@ -3617,28 +3507,6 @@
           </w:p>
         </w:tc>
       </w:tr>
-      <w:tr>
-        <w:trPr>
-          <w:cantSplit/>
-          <w:trHeight w:val="400" w:hRule="exact"/>
-        </w:trPr>
-        <w:tc>
-          <w:tcPr>
-            <w:tcW w:type="dxa" w:w="9098"/>
-            <w:tcBorders>
-              <w:top w:val="none" w:color="FFFFFF" w:sz="0"/>
-              <w:left w:val="none" w:color="FFFFFF" w:sz="0"/>
-              <w:bottom w:val="single" w:color="C9C5BC" w:sz="4"/>
-              <w:right w:val="none" w:color="FFFFFF" w:sz="0"/>
-            </w:tcBorders>
-          </w:tcPr>
-          <w:p>
-            <w:pPr>
-              <w:spacing w:after="0"/>
-            </w:pPr>
-          </w:p>
-        </w:tc>
-      </w:tr>
     </w:tbl>
     <w:p>
       <w:pPr>
@@ -4145,28 +4013,6 @@
           </w:p>
         </w:tc>
       </w:tr>
-      <w:tr>
-        <w:trPr>
-          <w:cantSplit/>
-          <w:trHeight w:val="400" w:hRule="exact"/>
-        </w:trPr>
-        <w:tc>
-          <w:tcPr>
-            <w:tcW w:type="dxa" w:w="9098"/>
-            <w:tcBorders>
-              <w:top w:val="none" w:color="FFFFFF" w:sz="0"/>
-              <w:left w:val="none" w:color="FFFFFF" w:sz="0"/>
-              <w:bottom w:val="single" w:color="C9C5BC" w:sz="4"/>
-              <w:right w:val="none" w:color="FFFFFF" w:sz="0"/>
-            </w:tcBorders>
-          </w:tcPr>
-          <w:p>
-            <w:pPr>
-              <w:spacing w:after="0"/>
-            </w:pPr>
-          </w:p>
-        </w:tc>
-      </w:tr>
     </w:tbl>
     <w:p>
       <w:pPr>
@@ -4256,28 +4102,6 @@
           </w:p>
         </w:tc>
       </w:tr>
-      <w:tr>
-        <w:trPr>
-          <w:cantSplit/>
-          <w:trHeight w:val="400" w:hRule="exact"/>
-        </w:trPr>
-        <w:tc>
-          <w:tcPr>
-            <w:tcW w:type="dxa" w:w="9098"/>
-            <w:tcBorders>
-              <w:top w:val="none" w:color="FFFFFF" w:sz="0"/>
-              <w:left w:val="none" w:color="FFFFFF" w:sz="0"/>
-              <w:bottom w:val="single" w:color="C9C5BC" w:sz="4"/>
-              <w:right w:val="none" w:color="FFFFFF" w:sz="0"/>
-            </w:tcBorders>
-          </w:tcPr>
-          <w:p>
-            <w:pPr>
-              <w:spacing w:after="0"/>
-            </w:pPr>
-          </w:p>
-        </w:tc>
-      </w:tr>
     </w:tbl>
     <w:p>
       <w:pPr>
@@ -4367,28 +4191,6 @@
           </w:p>
         </w:tc>
       </w:tr>
-      <w:tr>
-        <w:trPr>
-          <w:cantSplit/>
-          <w:trHeight w:val="400" w:hRule="exact"/>
-        </w:trPr>
-        <w:tc>
-          <w:tcPr>
-            <w:tcW w:type="dxa" w:w="9098"/>
-            <w:tcBorders>
-              <w:top w:val="none" w:color="FFFFFF" w:sz="0"/>
-              <w:left w:val="none" w:color="FFFFFF" w:sz="0"/>
-              <w:bottom w:val="single" w:color="C9C5BC" w:sz="4"/>
-              <w:right w:val="none" w:color="FFFFFF" w:sz="0"/>
-            </w:tcBorders>
-          </w:tcPr>
-          <w:p>
-            <w:pPr>
-              <w:spacing w:after="0"/>
-            </w:pPr>
-          </w:p>
-        </w:tc>
-      </w:tr>
     </w:tbl>
     <w:p>
       <w:pPr>
@@ -4478,28 +4280,6 @@
           </w:p>
         </w:tc>
       </w:tr>
-      <w:tr>
-        <w:trPr>
-          <w:cantSplit/>
-          <w:trHeight w:val="400" w:hRule="exact"/>
-        </w:trPr>
-        <w:tc>
-          <w:tcPr>
-            <w:tcW w:type="dxa" w:w="9098"/>
-            <w:tcBorders>
-              <w:top w:val="none" w:color="FFFFFF" w:sz="0"/>
-              <w:left w:val="none" w:color="FFFFFF" w:sz="0"/>
-              <w:bottom w:val="single" w:color="C9C5BC" w:sz="4"/>
-              <w:right w:val="none" w:color="FFFFFF" w:sz="0"/>
-            </w:tcBorders>
-          </w:tcPr>
-          <w:p>
-            <w:pPr>
-              <w:spacing w:after="0"/>
-            </w:pPr>
-          </w:p>
-        </w:tc>
-      </w:tr>
     </w:tbl>
     <w:p>
       <w:pPr>
@@ -4589,28 +4369,6 @@
           </w:p>
         </w:tc>
       </w:tr>
-      <w:tr>
-        <w:trPr>
-          <w:cantSplit/>
-          <w:trHeight w:val="400" w:hRule="exact"/>
-        </w:trPr>
-        <w:tc>
-          <w:tcPr>
-            <w:tcW w:type="dxa" w:w="9098"/>
-            <w:tcBorders>
-              <w:top w:val="none" w:color="FFFFFF" w:sz="0"/>
-              <w:left w:val="none" w:color="FFFFFF" w:sz="0"/>
-              <w:bottom w:val="single" w:color="C9C5BC" w:sz="4"/>
-              <w:right w:val="none" w:color="FFFFFF" w:sz="0"/>
-            </w:tcBorders>
-          </w:tcPr>
-          <w:p>
-            <w:pPr>
-              <w:spacing w:after="0"/>
-            </w:pPr>
-          </w:p>
-        </w:tc>
-      </w:tr>
     </w:tbl>
     <w:p>
       <w:pPr>
@@ -4700,28 +4458,6 @@
           </w:p>
         </w:tc>
       </w:tr>
-      <w:tr>
-        <w:trPr>
-          <w:cantSplit/>
-          <w:trHeight w:val="400" w:hRule="exact"/>
-        </w:trPr>
-        <w:tc>
-          <w:tcPr>
-            <w:tcW w:type="dxa" w:w="9098"/>
-            <w:tcBorders>
-              <w:top w:val="none" w:color="FFFFFF" w:sz="0"/>
-              <w:left w:val="none" w:color="FFFFFF" w:sz="0"/>
-              <w:bottom w:val="single" w:color="C9C5BC" w:sz="4"/>
-              <w:right w:val="none" w:color="FFFFFF" w:sz="0"/>
-            </w:tcBorders>
-          </w:tcPr>
-          <w:p>
-            <w:pPr>
-              <w:spacing w:after="0"/>
-            </w:pPr>
-          </w:p>
-        </w:tc>
-      </w:tr>
     </w:tbl>
     <w:p>
       <w:pPr>
@@ -5202,28 +4938,6 @@
           </w:p>
         </w:tc>
       </w:tr>
-      <w:tr>
-        <w:trPr>
-          <w:cantSplit/>
-          <w:trHeight w:val="400" w:hRule="exact"/>
-        </w:trPr>
-        <w:tc>
-          <w:tcPr>
-            <w:tcW w:type="dxa" w:w="9098"/>
-            <w:tcBorders>
-              <w:top w:val="none" w:color="FFFFFF" w:sz="0"/>
-              <w:left w:val="none" w:color="FFFFFF" w:sz="0"/>
-              <w:bottom w:val="single" w:color="C9C5BC" w:sz="4"/>
-              <w:right w:val="none" w:color="FFFFFF" w:sz="0"/>
-            </w:tcBorders>
-          </w:tcPr>
-          <w:p>
-            <w:pPr>
-              <w:spacing w:after="0"/>
-            </w:pPr>
-          </w:p>
-        </w:tc>
-      </w:tr>
     </w:tbl>
     <w:p>
       <w:pPr>
@@ -5313,28 +5027,6 @@
           </w:p>
         </w:tc>
       </w:tr>
-      <w:tr>
-        <w:trPr>
-          <w:cantSplit/>
-          <w:trHeight w:val="400" w:hRule="exact"/>
-        </w:trPr>
-        <w:tc>
-          <w:tcPr>
-            <w:tcW w:type="dxa" w:w="9098"/>
-            <w:tcBorders>
-              <w:top w:val="none" w:color="FFFFFF" w:sz="0"/>
-              <w:left w:val="none" w:color="FFFFFF" w:sz="0"/>
-              <w:bottom w:val="single" w:color="C9C5BC" w:sz="4"/>
-              <w:right w:val="none" w:color="FFFFFF" w:sz="0"/>
-            </w:tcBorders>
-          </w:tcPr>
-          <w:p>
-            <w:pPr>
-              <w:spacing w:after="0"/>
-            </w:pPr>
-          </w:p>
-        </w:tc>
-      </w:tr>
     </w:tbl>
     <w:p>
       <w:pPr>
@@ -5424,28 +5116,6 @@
           </w:p>
         </w:tc>
       </w:tr>
-      <w:tr>
-        <w:trPr>
-          <w:cantSplit/>
-          <w:trHeight w:val="400" w:hRule="exact"/>
-        </w:trPr>
-        <w:tc>
-          <w:tcPr>
-            <w:tcW w:type="dxa" w:w="9098"/>
-            <w:tcBorders>
-              <w:top w:val="none" w:color="FFFFFF" w:sz="0"/>
-              <w:left w:val="none" w:color="FFFFFF" w:sz="0"/>
-              <w:bottom w:val="single" w:color="C9C5BC" w:sz="4"/>
-              <w:right w:val="none" w:color="FFFFFF" w:sz="0"/>
-            </w:tcBorders>
-          </w:tcPr>
-          <w:p>
-            <w:pPr>
-              <w:spacing w:after="0"/>
-            </w:pPr>
-          </w:p>
-        </w:tc>
-      </w:tr>
     </w:tbl>
     <w:p>
       <w:pPr>
@@ -5535,28 +5205,6 @@
           </w:p>
         </w:tc>
       </w:tr>
-      <w:tr>
-        <w:trPr>
-          <w:cantSplit/>
-          <w:trHeight w:val="400" w:hRule="exact"/>
-        </w:trPr>
-        <w:tc>
-          <w:tcPr>
-            <w:tcW w:type="dxa" w:w="9098"/>
-            <w:tcBorders>
-              <w:top w:val="none" w:color="FFFFFF" w:sz="0"/>
-              <w:left w:val="none" w:color="FFFFFF" w:sz="0"/>
-              <w:bottom w:val="single" w:color="C9C5BC" w:sz="4"/>
-              <w:right w:val="none" w:color="FFFFFF" w:sz="0"/>
-            </w:tcBorders>
-          </w:tcPr>
-          <w:p>
-            <w:pPr>
-              <w:spacing w:after="0"/>
-            </w:pPr>
-          </w:p>
-        </w:tc>
-      </w:tr>
     </w:tbl>
     <w:p>
       <w:pPr>
@@ -5646,28 +5294,6 @@
           </w:p>
         </w:tc>
       </w:tr>
-      <w:tr>
-        <w:trPr>
-          <w:cantSplit/>
-          <w:trHeight w:val="400" w:hRule="exact"/>
-        </w:trPr>
-        <w:tc>
-          <w:tcPr>
-            <w:tcW w:type="dxa" w:w="9098"/>
-            <w:tcBorders>
-              <w:top w:val="none" w:color="FFFFFF" w:sz="0"/>
-              <w:left w:val="none" w:color="FFFFFF" w:sz="0"/>
-              <w:bottom w:val="single" w:color="C9C5BC" w:sz="4"/>
-              <w:right w:val="none" w:color="FFFFFF" w:sz="0"/>
-            </w:tcBorders>
-          </w:tcPr>
-          <w:p>
-            <w:pPr>
-              <w:spacing w:after="0"/>
-            </w:pPr>
-          </w:p>
-        </w:tc>
-      </w:tr>
     </w:tbl>
     <w:p>
       <w:pPr>
@@ -5757,28 +5383,6 @@
           </w:p>
         </w:tc>
       </w:tr>
-      <w:tr>
-        <w:trPr>
-          <w:cantSplit/>
-          <w:trHeight w:val="400" w:hRule="exact"/>
-        </w:trPr>
-        <w:tc>
-          <w:tcPr>
-            <w:tcW w:type="dxa" w:w="9098"/>
-            <w:tcBorders>
-              <w:top w:val="none" w:color="FFFFFF" w:sz="0"/>
-              <w:left w:val="none" w:color="FFFFFF" w:sz="0"/>
-              <w:bottom w:val="single" w:color="C9C5BC" w:sz="4"/>
-              <w:right w:val="none" w:color="FFFFFF" w:sz="0"/>
-            </w:tcBorders>
-          </w:tcPr>
-          <w:p>
-            <w:pPr>
-              <w:spacing w:after="0"/>
-            </w:pPr>
-          </w:p>
-        </w:tc>
-      </w:tr>
     </w:tbl>
     <w:p>
       <w:pPr>
@@ -6311,28 +5915,6 @@
           </w:p>
         </w:tc>
       </w:tr>
-      <w:tr>
-        <w:trPr>
-          <w:cantSplit/>
-          <w:trHeight w:val="400" w:hRule="exact"/>
-        </w:trPr>
-        <w:tc>
-          <w:tcPr>
-            <w:tcW w:type="dxa" w:w="9098"/>
-            <w:tcBorders>
-              <w:top w:val="none" w:color="FFFFFF" w:sz="0"/>
-              <w:left w:val="none" w:color="FFFFFF" w:sz="0"/>
-              <w:bottom w:val="single" w:color="C9C5BC" w:sz="4"/>
-              <w:right w:val="none" w:color="FFFFFF" w:sz="0"/>
-            </w:tcBorders>
-          </w:tcPr>
-          <w:p>
-            <w:pPr>
-              <w:spacing w:after="0"/>
-            </w:pPr>
-          </w:p>
-        </w:tc>
-      </w:tr>
     </w:tbl>
     <w:p>
       <w:pPr>
@@ -6422,28 +6004,6 @@
           </w:p>
         </w:tc>
       </w:tr>
-      <w:tr>
-        <w:trPr>
-          <w:cantSplit/>
-          <w:trHeight w:val="400" w:hRule="exact"/>
-        </w:trPr>
-        <w:tc>
-          <w:tcPr>
-            <w:tcW w:type="dxa" w:w="9098"/>
-            <w:tcBorders>
-              <w:top w:val="none" w:color="FFFFFF" w:sz="0"/>
-              <w:left w:val="none" w:color="FFFFFF" w:sz="0"/>
-              <w:bottom w:val="single" w:color="C9C5BC" w:sz="4"/>
-              <w:right w:val="none" w:color="FFFFFF" w:sz="0"/>
-            </w:tcBorders>
-          </w:tcPr>
-          <w:p>
-            <w:pPr>
-              <w:spacing w:after="0"/>
-            </w:pPr>
-          </w:p>
-        </w:tc>
-      </w:tr>
     </w:tbl>
     <w:p>
       <w:pPr>
@@ -6533,28 +6093,6 @@
           </w:p>
         </w:tc>
       </w:tr>
-      <w:tr>
-        <w:trPr>
-          <w:cantSplit/>
-          <w:trHeight w:val="400" w:hRule="exact"/>
-        </w:trPr>
-        <w:tc>
-          <w:tcPr>
-            <w:tcW w:type="dxa" w:w="9098"/>
-            <w:tcBorders>
-              <w:top w:val="none" w:color="FFFFFF" w:sz="0"/>
-              <w:left w:val="none" w:color="FFFFFF" w:sz="0"/>
-              <w:bottom w:val="single" w:color="C9C5BC" w:sz="4"/>
-              <w:right w:val="none" w:color="FFFFFF" w:sz="0"/>
-            </w:tcBorders>
-          </w:tcPr>
-          <w:p>
-            <w:pPr>
-              <w:spacing w:after="0"/>
-            </w:pPr>
-          </w:p>
-        </w:tc>
-      </w:tr>
     </w:tbl>
     <w:p>
       <w:pPr>
@@ -6644,28 +6182,6 @@
           </w:p>
         </w:tc>
       </w:tr>
-      <w:tr>
-        <w:trPr>
-          <w:cantSplit/>
-          <w:trHeight w:val="400" w:hRule="exact"/>
-        </w:trPr>
-        <w:tc>
-          <w:tcPr>
-            <w:tcW w:type="dxa" w:w="9098"/>
-            <w:tcBorders>
-              <w:top w:val="none" w:color="FFFFFF" w:sz="0"/>
-              <w:left w:val="none" w:color="FFFFFF" w:sz="0"/>
-              <w:bottom w:val="single" w:color="C9C5BC" w:sz="4"/>
-              <w:right w:val="none" w:color="FFFFFF" w:sz="0"/>
-            </w:tcBorders>
-          </w:tcPr>
-          <w:p>
-            <w:pPr>
-              <w:spacing w:after="0"/>
-            </w:pPr>
-          </w:p>
-        </w:tc>
-      </w:tr>
     </w:tbl>
     <w:p>
       <w:pPr>
@@ -6755,28 +6271,6 @@
           </w:p>
         </w:tc>
       </w:tr>
-      <w:tr>
-        <w:trPr>
-          <w:cantSplit/>
-          <w:trHeight w:val="400" w:hRule="exact"/>
-        </w:trPr>
-        <w:tc>
-          <w:tcPr>
-            <w:tcW w:type="dxa" w:w="9098"/>
-            <w:tcBorders>
-              <w:top w:val="none" w:color="FFFFFF" w:sz="0"/>
-              <w:left w:val="none" w:color="FFFFFF" w:sz="0"/>
-              <w:bottom w:val="single" w:color="C9C5BC" w:sz="4"/>
-              <w:right w:val="none" w:color="FFFFFF" w:sz="0"/>
-            </w:tcBorders>
-          </w:tcPr>
-          <w:p>
-            <w:pPr>
-              <w:spacing w:after="0"/>
-            </w:pPr>
-          </w:p>
-        </w:tc>
-      </w:tr>
     </w:tbl>
     <w:p>
       <w:pPr>
@@ -6866,28 +6360,6 @@
           </w:p>
         </w:tc>
       </w:tr>
-      <w:tr>
-        <w:trPr>
-          <w:cantSplit/>
-          <w:trHeight w:val="400" w:hRule="exact"/>
-        </w:trPr>
-        <w:tc>
-          <w:tcPr>
-            <w:tcW w:type="dxa" w:w="9098"/>
-            <w:tcBorders>
-              <w:top w:val="none" w:color="FFFFFF" w:sz="0"/>
-              <w:left w:val="none" w:color="FFFFFF" w:sz="0"/>
-              <w:bottom w:val="single" w:color="C9C5BC" w:sz="4"/>
-              <w:right w:val="none" w:color="FFFFFF" w:sz="0"/>
-            </w:tcBorders>
-          </w:tcPr>
-          <w:p>
-            <w:pPr>
-              <w:spacing w:after="0"/>
-            </w:pPr>
-          </w:p>
-        </w:tc>
-      </w:tr>
     </w:tbl>
     <w:p>
       <w:pPr>
@@ -7368,28 +6840,6 @@
           </w:p>
         </w:tc>
       </w:tr>
-      <w:tr>
-        <w:trPr>
-          <w:cantSplit/>
-          <w:trHeight w:val="400" w:hRule="exact"/>
-        </w:trPr>
-        <w:tc>
-          <w:tcPr>
-            <w:tcW w:type="dxa" w:w="9098"/>
-            <w:tcBorders>
-              <w:top w:val="none" w:color="FFFFFF" w:sz="0"/>
-              <w:left w:val="none" w:color="FFFFFF" w:sz="0"/>
-              <w:bottom w:val="single" w:color="C9C5BC" w:sz="4"/>
-              <w:right w:val="none" w:color="FFFFFF" w:sz="0"/>
-            </w:tcBorders>
-          </w:tcPr>
-          <w:p>
-            <w:pPr>
-              <w:spacing w:after="0"/>
-            </w:pPr>
-          </w:p>
-        </w:tc>
-      </w:tr>
     </w:tbl>
     <w:p>
       <w:pPr>
@@ -7479,28 +6929,6 @@
           </w:p>
         </w:tc>
       </w:tr>
-      <w:tr>
-        <w:trPr>
-          <w:cantSplit/>
-          <w:trHeight w:val="400" w:hRule="exact"/>
-        </w:trPr>
-        <w:tc>
-          <w:tcPr>
-            <w:tcW w:type="dxa" w:w="9098"/>
-            <w:tcBorders>
-              <w:top w:val="none" w:color="FFFFFF" w:sz="0"/>
-              <w:left w:val="none" w:color="FFFFFF" w:sz="0"/>
-              <w:bottom w:val="single" w:color="C9C5BC" w:sz="4"/>
-              <w:right w:val="none" w:color="FFFFFF" w:sz="0"/>
-            </w:tcBorders>
-          </w:tcPr>
-          <w:p>
-            <w:pPr>
-              <w:spacing w:after="0"/>
-            </w:pPr>
-          </w:p>
-        </w:tc>
-      </w:tr>
     </w:tbl>
     <w:p>
       <w:pPr>
@@ -7590,28 +7018,6 @@
           </w:p>
         </w:tc>
       </w:tr>
-      <w:tr>
-        <w:trPr>
-          <w:cantSplit/>
-          <w:trHeight w:val="400" w:hRule="exact"/>
-        </w:trPr>
-        <w:tc>
-          <w:tcPr>
-            <w:tcW w:type="dxa" w:w="9098"/>
-            <w:tcBorders>
-              <w:top w:val="none" w:color="FFFFFF" w:sz="0"/>
-              <w:left w:val="none" w:color="FFFFFF" w:sz="0"/>
-              <w:bottom w:val="single" w:color="C9C5BC" w:sz="4"/>
-              <w:right w:val="none" w:color="FFFFFF" w:sz="0"/>
-            </w:tcBorders>
-          </w:tcPr>
-          <w:p>
-            <w:pPr>
-              <w:spacing w:after="0"/>
-            </w:pPr>
-          </w:p>
-        </w:tc>
-      </w:tr>
     </w:tbl>
     <w:p>
       <w:pPr>
@@ -7701,28 +7107,6 @@
           </w:p>
         </w:tc>
       </w:tr>
-      <w:tr>
-        <w:trPr>
-          <w:cantSplit/>
-          <w:trHeight w:val="400" w:hRule="exact"/>
-        </w:trPr>
-        <w:tc>
-          <w:tcPr>
-            <w:tcW w:type="dxa" w:w="9098"/>
-            <w:tcBorders>
-              <w:top w:val="none" w:color="FFFFFF" w:sz="0"/>
-              <w:left w:val="none" w:color="FFFFFF" w:sz="0"/>
-              <w:bottom w:val="single" w:color="C9C5BC" w:sz="4"/>
-              <w:right w:val="none" w:color="FFFFFF" w:sz="0"/>
-            </w:tcBorders>
-          </w:tcPr>
-          <w:p>
-            <w:pPr>
-              <w:spacing w:after="0"/>
-            </w:pPr>
-          </w:p>
-        </w:tc>
-      </w:tr>
     </w:tbl>
     <w:p>
       <w:pPr>
@@ -7812,28 +7196,6 @@
           </w:p>
         </w:tc>
       </w:tr>
-      <w:tr>
-        <w:trPr>
-          <w:cantSplit/>
-          <w:trHeight w:val="400" w:hRule="exact"/>
-        </w:trPr>
-        <w:tc>
-          <w:tcPr>
-            <w:tcW w:type="dxa" w:w="9098"/>
-            <w:tcBorders>
-              <w:top w:val="none" w:color="FFFFFF" w:sz="0"/>
-              <w:left w:val="none" w:color="FFFFFF" w:sz="0"/>
-              <w:bottom w:val="single" w:color="C9C5BC" w:sz="4"/>
-              <w:right w:val="none" w:color="FFFFFF" w:sz="0"/>
-            </w:tcBorders>
-          </w:tcPr>
-          <w:p>
-            <w:pPr>
-              <w:spacing w:after="0"/>
-            </w:pPr>
-          </w:p>
-        </w:tc>
-      </w:tr>
     </w:tbl>
     <w:p>
       <w:pPr>
@@ -7923,28 +7285,6 @@
           </w:p>
         </w:tc>
       </w:tr>
-      <w:tr>
-        <w:trPr>
-          <w:cantSplit/>
-          <w:trHeight w:val="400" w:hRule="exact"/>
-        </w:trPr>
-        <w:tc>
-          <w:tcPr>
-            <w:tcW w:type="dxa" w:w="9098"/>
-            <w:tcBorders>
-              <w:top w:val="none" w:color="FFFFFF" w:sz="0"/>
-              <w:left w:val="none" w:color="FFFFFF" w:sz="0"/>
-              <w:bottom w:val="single" w:color="C9C5BC" w:sz="4"/>
-              <w:right w:val="none" w:color="FFFFFF" w:sz="0"/>
-            </w:tcBorders>
-          </w:tcPr>
-          <w:p>
-            <w:pPr>
-              <w:spacing w:after="0"/>
-            </w:pPr>
-          </w:p>
-        </w:tc>
-      </w:tr>
     </w:tbl>
     <w:p>
       <w:pPr>
@@ -8425,28 +7765,6 @@
           </w:p>
         </w:tc>
       </w:tr>
-      <w:tr>
-        <w:trPr>
-          <w:cantSplit/>
-          <w:trHeight w:val="400" w:hRule="exact"/>
-        </w:trPr>
-        <w:tc>
-          <w:tcPr>
-            <w:tcW w:type="dxa" w:w="9098"/>
-            <w:tcBorders>
-              <w:top w:val="none" w:color="FFFFFF" w:sz="0"/>
-              <w:left w:val="none" w:color="FFFFFF" w:sz="0"/>
-              <w:bottom w:val="single" w:color="C9C5BC" w:sz="4"/>
-              <w:right w:val="none" w:color="FFFFFF" w:sz="0"/>
-            </w:tcBorders>
-          </w:tcPr>
-          <w:p>
-            <w:pPr>
-              <w:spacing w:after="0"/>
-            </w:pPr>
-          </w:p>
-        </w:tc>
-      </w:tr>
     </w:tbl>
     <w:p>
       <w:pPr>
@@ -8536,28 +7854,6 @@
           </w:p>
         </w:tc>
       </w:tr>
-      <w:tr>
-        <w:trPr>
-          <w:cantSplit/>
-          <w:trHeight w:val="400" w:hRule="exact"/>
-        </w:trPr>
-        <w:tc>
-          <w:tcPr>
-            <w:tcW w:type="dxa" w:w="9098"/>
-            <w:tcBorders>
-              <w:top w:val="none" w:color="FFFFFF" w:sz="0"/>
-              <w:left w:val="none" w:color="FFFFFF" w:sz="0"/>
-              <w:bottom w:val="single" w:color="C9C5BC" w:sz="4"/>
-              <w:right w:val="none" w:color="FFFFFF" w:sz="0"/>
-            </w:tcBorders>
-          </w:tcPr>
-          <w:p>
-            <w:pPr>
-              <w:spacing w:after="0"/>
-            </w:pPr>
-          </w:p>
-        </w:tc>
-      </w:tr>
     </w:tbl>
     <w:p>
       <w:pPr>
@@ -8647,28 +7943,6 @@
           </w:p>
         </w:tc>
       </w:tr>
-      <w:tr>
-        <w:trPr>
-          <w:cantSplit/>
-          <w:trHeight w:val="400" w:hRule="exact"/>
-        </w:trPr>
-        <w:tc>
-          <w:tcPr>
-            <w:tcW w:type="dxa" w:w="9098"/>
-            <w:tcBorders>
-              <w:top w:val="none" w:color="FFFFFF" w:sz="0"/>
-              <w:left w:val="none" w:color="FFFFFF" w:sz="0"/>
-              <w:bottom w:val="single" w:color="C9C5BC" w:sz="4"/>
-              <w:right w:val="none" w:color="FFFFFF" w:sz="0"/>
-            </w:tcBorders>
-          </w:tcPr>
-          <w:p>
-            <w:pPr>
-              <w:spacing w:after="0"/>
-            </w:pPr>
-          </w:p>
-        </w:tc>
-      </w:tr>
     </w:tbl>
     <w:p>
       <w:pPr>
@@ -8758,28 +8032,6 @@
           </w:p>
         </w:tc>
       </w:tr>
-      <w:tr>
-        <w:trPr>
-          <w:cantSplit/>
-          <w:trHeight w:val="400" w:hRule="exact"/>
-        </w:trPr>
-        <w:tc>
-          <w:tcPr>
-            <w:tcW w:type="dxa" w:w="9098"/>
-            <w:tcBorders>
-              <w:top w:val="none" w:color="FFFFFF" w:sz="0"/>
-              <w:left w:val="none" w:color="FFFFFF" w:sz="0"/>
-              <w:bottom w:val="single" w:color="C9C5BC" w:sz="4"/>
-              <w:right w:val="none" w:color="FFFFFF" w:sz="0"/>
-            </w:tcBorders>
-          </w:tcPr>
-          <w:p>
-            <w:pPr>
-              <w:spacing w:after="0"/>
-            </w:pPr>
-          </w:p>
-        </w:tc>
-      </w:tr>
     </w:tbl>
     <w:p>
       <w:pPr>
@@ -8869,28 +8121,6 @@
           </w:p>
         </w:tc>
       </w:tr>
-      <w:tr>
-        <w:trPr>
-          <w:cantSplit/>
-          <w:trHeight w:val="400" w:hRule="exact"/>
-        </w:trPr>
-        <w:tc>
-          <w:tcPr>
-            <w:tcW w:type="dxa" w:w="9098"/>
-            <w:tcBorders>
-              <w:top w:val="none" w:color="FFFFFF" w:sz="0"/>
-              <w:left w:val="none" w:color="FFFFFF" w:sz="0"/>
-              <w:bottom w:val="single" w:color="C9C5BC" w:sz="4"/>
-              <w:right w:val="none" w:color="FFFFFF" w:sz="0"/>
-            </w:tcBorders>
-          </w:tcPr>
-          <w:p>
-            <w:pPr>
-              <w:spacing w:after="0"/>
-            </w:pPr>
-          </w:p>
-        </w:tc>
-      </w:tr>
     </w:tbl>
     <w:p>
       <w:pPr>
@@ -8980,28 +8210,6 @@
           </w:p>
         </w:tc>
       </w:tr>
-      <w:tr>
-        <w:trPr>
-          <w:cantSplit/>
-          <w:trHeight w:val="400" w:hRule="exact"/>
-        </w:trPr>
-        <w:tc>
-          <w:tcPr>
-            <w:tcW w:type="dxa" w:w="9098"/>
-            <w:tcBorders>
-              <w:top w:val="none" w:color="FFFFFF" w:sz="0"/>
-              <w:left w:val="none" w:color="FFFFFF" w:sz="0"/>
-              <w:bottom w:val="single" w:color="C9C5BC" w:sz="4"/>
-              <w:right w:val="none" w:color="FFFFFF" w:sz="0"/>
-            </w:tcBorders>
-          </w:tcPr>
-          <w:p>
-            <w:pPr>
-              <w:spacing w:after="0"/>
-            </w:pPr>
-          </w:p>
-        </w:tc>
-      </w:tr>
     </w:tbl>
     <w:p>
       <w:pPr>
@@ -9508,28 +8716,6 @@
           </w:p>
         </w:tc>
       </w:tr>
-      <w:tr>
-        <w:trPr>
-          <w:cantSplit/>
-          <w:trHeight w:val="400" w:hRule="exact"/>
-        </w:trPr>
-        <w:tc>
-          <w:tcPr>
-            <w:tcW w:type="dxa" w:w="9098"/>
-            <w:tcBorders>
-              <w:top w:val="none" w:color="FFFFFF" w:sz="0"/>
-              <w:left w:val="none" w:color="FFFFFF" w:sz="0"/>
-              <w:bottom w:val="single" w:color="C9C5BC" w:sz="4"/>
-              <w:right w:val="none" w:color="FFFFFF" w:sz="0"/>
-            </w:tcBorders>
-          </w:tcPr>
-          <w:p>
-            <w:pPr>
-              <w:spacing w:after="0"/>
-            </w:pPr>
-          </w:p>
-        </w:tc>
-      </w:tr>
     </w:tbl>
     <w:p>
       <w:pPr>
@@ -9619,28 +8805,6 @@
           </w:p>
         </w:tc>
       </w:tr>
-      <w:tr>
-        <w:trPr>
-          <w:cantSplit/>
-          <w:trHeight w:val="400" w:hRule="exact"/>
-        </w:trPr>
-        <w:tc>
-          <w:tcPr>
-            <w:tcW w:type="dxa" w:w="9098"/>
-            <w:tcBorders>
-              <w:top w:val="none" w:color="FFFFFF" w:sz="0"/>
-              <w:left w:val="none" w:color="FFFFFF" w:sz="0"/>
-              <w:bottom w:val="single" w:color="C9C5BC" w:sz="4"/>
-              <w:right w:val="none" w:color="FFFFFF" w:sz="0"/>
-            </w:tcBorders>
-          </w:tcPr>
-          <w:p>
-            <w:pPr>
-              <w:spacing w:after="0"/>
-            </w:pPr>
-          </w:p>
-        </w:tc>
-      </w:tr>
     </w:tbl>
     <w:p>
       <w:pPr>
@@ -9730,28 +8894,6 @@
           </w:p>
         </w:tc>
       </w:tr>
-      <w:tr>
-        <w:trPr>
-          <w:cantSplit/>
-          <w:trHeight w:val="400" w:hRule="exact"/>
-        </w:trPr>
-        <w:tc>
-          <w:tcPr>
-            <w:tcW w:type="dxa" w:w="9098"/>
-            <w:tcBorders>
-              <w:top w:val="none" w:color="FFFFFF" w:sz="0"/>
-              <w:left w:val="none" w:color="FFFFFF" w:sz="0"/>
-              <w:bottom w:val="single" w:color="C9C5BC" w:sz="4"/>
-              <w:right w:val="none" w:color="FFFFFF" w:sz="0"/>
-            </w:tcBorders>
-          </w:tcPr>
-          <w:p>
-            <w:pPr>
-              <w:spacing w:after="0"/>
-            </w:pPr>
-          </w:p>
-        </w:tc>
-      </w:tr>
     </w:tbl>
     <w:p>
       <w:pPr>
@@ -9841,28 +8983,6 @@
           </w:p>
         </w:tc>
       </w:tr>
-      <w:tr>
-        <w:trPr>
-          <w:cantSplit/>
-          <w:trHeight w:val="400" w:hRule="exact"/>
-        </w:trPr>
-        <w:tc>
-          <w:tcPr>
-            <w:tcW w:type="dxa" w:w="9098"/>
-            <w:tcBorders>
-              <w:top w:val="none" w:color="FFFFFF" w:sz="0"/>
-              <w:left w:val="none" w:color="FFFFFF" w:sz="0"/>
-              <w:bottom w:val="single" w:color="C9C5BC" w:sz="4"/>
-              <w:right w:val="none" w:color="FFFFFF" w:sz="0"/>
-            </w:tcBorders>
-          </w:tcPr>
-          <w:p>
-            <w:pPr>
-              <w:spacing w:after="0"/>
-            </w:pPr>
-          </w:p>
-        </w:tc>
-      </w:tr>
     </w:tbl>
     <w:p>
       <w:pPr>
@@ -9952,28 +9072,6 @@
           </w:p>
         </w:tc>
       </w:tr>
-      <w:tr>
-        <w:trPr>
-          <w:cantSplit/>
-          <w:trHeight w:val="400" w:hRule="exact"/>
-        </w:trPr>
-        <w:tc>
-          <w:tcPr>
-            <w:tcW w:type="dxa" w:w="9098"/>
-            <w:tcBorders>
-              <w:top w:val="none" w:color="FFFFFF" w:sz="0"/>
-              <w:left w:val="none" w:color="FFFFFF" w:sz="0"/>
-              <w:bottom w:val="single" w:color="C9C5BC" w:sz="4"/>
-              <w:right w:val="none" w:color="FFFFFF" w:sz="0"/>
-            </w:tcBorders>
-          </w:tcPr>
-          <w:p>
-            <w:pPr>
-              <w:spacing w:after="0"/>
-            </w:pPr>
-          </w:p>
-        </w:tc>
-      </w:tr>
     </w:tbl>
     <w:p>
       <w:pPr>
@@ -10454,28 +9552,6 @@
           </w:p>
         </w:tc>
       </w:tr>
-      <w:tr>
-        <w:trPr>
-          <w:cantSplit/>
-          <w:trHeight w:val="400" w:hRule="exact"/>
-        </w:trPr>
-        <w:tc>
-          <w:tcPr>
-            <w:tcW w:type="dxa" w:w="9098"/>
-            <w:tcBorders>
-              <w:top w:val="none" w:color="FFFFFF" w:sz="0"/>
-              <w:left w:val="none" w:color="FFFFFF" w:sz="0"/>
-              <w:bottom w:val="single" w:color="C9C5BC" w:sz="4"/>
-              <w:right w:val="none" w:color="FFFFFF" w:sz="0"/>
-            </w:tcBorders>
-          </w:tcPr>
-          <w:p>
-            <w:pPr>
-              <w:spacing w:after="0"/>
-            </w:pPr>
-          </w:p>
-        </w:tc>
-      </w:tr>
     </w:tbl>
     <w:p>
       <w:pPr>
@@ -10565,28 +9641,6 @@
           </w:p>
         </w:tc>
       </w:tr>
-      <w:tr>
-        <w:trPr>
-          <w:cantSplit/>
-          <w:trHeight w:val="400" w:hRule="exact"/>
-        </w:trPr>
-        <w:tc>
-          <w:tcPr>
-            <w:tcW w:type="dxa" w:w="9098"/>
-            <w:tcBorders>
-              <w:top w:val="none" w:color="FFFFFF" w:sz="0"/>
-              <w:left w:val="none" w:color="FFFFFF" w:sz="0"/>
-              <w:bottom w:val="single" w:color="C9C5BC" w:sz="4"/>
-              <w:right w:val="none" w:color="FFFFFF" w:sz="0"/>
-            </w:tcBorders>
-          </w:tcPr>
-          <w:p>
-            <w:pPr>
-              <w:spacing w:after="0"/>
-            </w:pPr>
-          </w:p>
-        </w:tc>
-      </w:tr>
     </w:tbl>
     <w:p>
       <w:pPr>
@@ -10676,28 +9730,6 @@
           </w:p>
         </w:tc>
       </w:tr>
-      <w:tr>
-        <w:trPr>
-          <w:cantSplit/>
-          <w:trHeight w:val="400" w:hRule="exact"/>
-        </w:trPr>
-        <w:tc>
-          <w:tcPr>
-            <w:tcW w:type="dxa" w:w="9098"/>
-            <w:tcBorders>
-              <w:top w:val="none" w:color="FFFFFF" w:sz="0"/>
-              <w:left w:val="none" w:color="FFFFFF" w:sz="0"/>
-              <w:bottom w:val="single" w:color="C9C5BC" w:sz="4"/>
-              <w:right w:val="none" w:color="FFFFFF" w:sz="0"/>
-            </w:tcBorders>
-          </w:tcPr>
-          <w:p>
-            <w:pPr>
-              <w:spacing w:after="0"/>
-            </w:pPr>
-          </w:p>
-        </w:tc>
-      </w:tr>
     </w:tbl>
     <w:p>
       <w:pPr>
@@ -10787,28 +9819,6 @@
           </w:p>
         </w:tc>
       </w:tr>
-      <w:tr>
-        <w:trPr>
-          <w:cantSplit/>
-          <w:trHeight w:val="400" w:hRule="exact"/>
-        </w:trPr>
-        <w:tc>
-          <w:tcPr>
-            <w:tcW w:type="dxa" w:w="9098"/>
-            <w:tcBorders>
-              <w:top w:val="none" w:color="FFFFFF" w:sz="0"/>
-              <w:left w:val="none" w:color="FFFFFF" w:sz="0"/>
-              <w:bottom w:val="single" w:color="C9C5BC" w:sz="4"/>
-              <w:right w:val="none" w:color="FFFFFF" w:sz="0"/>
-            </w:tcBorders>
-          </w:tcPr>
-          <w:p>
-            <w:pPr>
-              <w:spacing w:after="0"/>
-            </w:pPr>
-          </w:p>
-        </w:tc>
-      </w:tr>
     </w:tbl>
     <w:p>
       <w:pPr>
@@ -10898,28 +9908,6 @@
           </w:p>
         </w:tc>
       </w:tr>
-      <w:tr>
-        <w:trPr>
-          <w:cantSplit/>
-          <w:trHeight w:val="400" w:hRule="exact"/>
-        </w:trPr>
-        <w:tc>
-          <w:tcPr>
-            <w:tcW w:type="dxa" w:w="9098"/>
-            <w:tcBorders>
-              <w:top w:val="none" w:color="FFFFFF" w:sz="0"/>
-              <w:left w:val="none" w:color="FFFFFF" w:sz="0"/>
-              <w:bottom w:val="single" w:color="C9C5BC" w:sz="4"/>
-              <w:right w:val="none" w:color="FFFFFF" w:sz="0"/>
-            </w:tcBorders>
-          </w:tcPr>
-          <w:p>
-            <w:pPr>
-              <w:spacing w:after="0"/>
-            </w:pPr>
-          </w:p>
-        </w:tc>
-      </w:tr>
     </w:tbl>
     <w:p>
       <w:pPr>
@@ -11009,28 +9997,6 @@
           </w:p>
         </w:tc>
       </w:tr>
-      <w:tr>
-        <w:trPr>
-          <w:cantSplit/>
-          <w:trHeight w:val="400" w:hRule="exact"/>
-        </w:trPr>
-        <w:tc>
-          <w:tcPr>
-            <w:tcW w:type="dxa" w:w="9098"/>
-            <w:tcBorders>
-              <w:top w:val="none" w:color="FFFFFF" w:sz="0"/>
-              <w:left w:val="none" w:color="FFFFFF" w:sz="0"/>
-              <w:bottom w:val="single" w:color="C9C5BC" w:sz="4"/>
-              <w:right w:val="none" w:color="FFFFFF" w:sz="0"/>
-            </w:tcBorders>
-          </w:tcPr>
-          <w:p>
-            <w:pPr>
-              <w:spacing w:after="0"/>
-            </w:pPr>
-          </w:p>
-        </w:tc>
-      </w:tr>
     </w:tbl>
     <w:p>
       <w:pPr>
@@ -11563,28 +10529,6 @@
           </w:p>
         </w:tc>
       </w:tr>
-      <w:tr>
-        <w:trPr>
-          <w:cantSplit/>
-          <w:trHeight w:val="400" w:hRule="exact"/>
-        </w:trPr>
-        <w:tc>
-          <w:tcPr>
-            <w:tcW w:type="dxa" w:w="9098"/>
-            <w:tcBorders>
-              <w:top w:val="none" w:color="FFFFFF" w:sz="0"/>
-              <w:left w:val="none" w:color="FFFFFF" w:sz="0"/>
-              <w:bottom w:val="single" w:color="C9C5BC" w:sz="4"/>
-              <w:right w:val="none" w:color="FFFFFF" w:sz="0"/>
-            </w:tcBorders>
-          </w:tcPr>
-          <w:p>
-            <w:pPr>
-              <w:spacing w:after="0"/>
-            </w:pPr>
-          </w:p>
-        </w:tc>
-      </w:tr>
     </w:tbl>
     <w:p>
       <w:pPr>
@@ -11674,28 +10618,6 @@
           </w:p>
         </w:tc>
       </w:tr>
-      <w:tr>
-        <w:trPr>
-          <w:cantSplit/>
-          <w:trHeight w:val="400" w:hRule="exact"/>
-        </w:trPr>
-        <w:tc>
-          <w:tcPr>
-            <w:tcW w:type="dxa" w:w="9098"/>
-            <w:tcBorders>
-              <w:top w:val="none" w:color="FFFFFF" w:sz="0"/>
-              <w:left w:val="none" w:color="FFFFFF" w:sz="0"/>
-              <w:bottom w:val="single" w:color="C9C5BC" w:sz="4"/>
-              <w:right w:val="none" w:color="FFFFFF" w:sz="0"/>
-            </w:tcBorders>
-          </w:tcPr>
-          <w:p>
-            <w:pPr>
-              <w:spacing w:after="0"/>
-            </w:pPr>
-          </w:p>
-        </w:tc>
-      </w:tr>
     </w:tbl>
     <w:p>
       <w:pPr>
@@ -11785,28 +10707,6 @@
           </w:p>
         </w:tc>
       </w:tr>
-      <w:tr>
-        <w:trPr>
-          <w:cantSplit/>
-          <w:trHeight w:val="400" w:hRule="exact"/>
-        </w:trPr>
-        <w:tc>
-          <w:tcPr>
-            <w:tcW w:type="dxa" w:w="9098"/>
-            <w:tcBorders>
-              <w:top w:val="none" w:color="FFFFFF" w:sz="0"/>
-              <w:left w:val="none" w:color="FFFFFF" w:sz="0"/>
-              <w:bottom w:val="single" w:color="C9C5BC" w:sz="4"/>
-              <w:right w:val="none" w:color="FFFFFF" w:sz="0"/>
-            </w:tcBorders>
-          </w:tcPr>
-          <w:p>
-            <w:pPr>
-              <w:spacing w:after="0"/>
-            </w:pPr>
-          </w:p>
-        </w:tc>
-      </w:tr>
     </w:tbl>
     <w:p>
       <w:pPr>
@@ -11896,28 +10796,6 @@
           </w:p>
         </w:tc>
       </w:tr>
-      <w:tr>
-        <w:trPr>
-          <w:cantSplit/>
-          <w:trHeight w:val="400" w:hRule="exact"/>
-        </w:trPr>
-        <w:tc>
-          <w:tcPr>
-            <w:tcW w:type="dxa" w:w="9098"/>
-            <w:tcBorders>
-              <w:top w:val="none" w:color="FFFFFF" w:sz="0"/>
-              <w:left w:val="none" w:color="FFFFFF" w:sz="0"/>
-              <w:bottom w:val="single" w:color="C9C5BC" w:sz="4"/>
-              <w:right w:val="none" w:color="FFFFFF" w:sz="0"/>
-            </w:tcBorders>
-          </w:tcPr>
-          <w:p>
-            <w:pPr>
-              <w:spacing w:after="0"/>
-            </w:pPr>
-          </w:p>
-        </w:tc>
-      </w:tr>
     </w:tbl>
     <w:p>
       <w:pPr>
@@ -12007,28 +10885,6 @@
           </w:p>
         </w:tc>
       </w:tr>
-      <w:tr>
-        <w:trPr>
-          <w:cantSplit/>
-          <w:trHeight w:val="400" w:hRule="exact"/>
-        </w:trPr>
-        <w:tc>
-          <w:tcPr>
-            <w:tcW w:type="dxa" w:w="9098"/>
-            <w:tcBorders>
-              <w:top w:val="none" w:color="FFFFFF" w:sz="0"/>
-              <w:left w:val="none" w:color="FFFFFF" w:sz="0"/>
-              <w:bottom w:val="single" w:color="C9C5BC" w:sz="4"/>
-              <w:right w:val="none" w:color="FFFFFF" w:sz="0"/>
-            </w:tcBorders>
-          </w:tcPr>
-          <w:p>
-            <w:pPr>
-              <w:spacing w:after="0"/>
-            </w:pPr>
-          </w:p>
-        </w:tc>
-      </w:tr>
     </w:tbl>
     <w:p>
       <w:pPr>
@@ -12561,28 +11417,6 @@
           </w:p>
         </w:tc>
       </w:tr>
-      <w:tr>
-        <w:trPr>
-          <w:cantSplit/>
-          <w:trHeight w:val="400" w:hRule="exact"/>
-        </w:trPr>
-        <w:tc>
-          <w:tcPr>
-            <w:tcW w:type="dxa" w:w="9098"/>
-            <w:tcBorders>
-              <w:top w:val="none" w:color="FFFFFF" w:sz="0"/>
-              <w:left w:val="none" w:color="FFFFFF" w:sz="0"/>
-              <w:bottom w:val="single" w:color="C9C5BC" w:sz="4"/>
-              <w:right w:val="none" w:color="FFFFFF" w:sz="0"/>
-            </w:tcBorders>
-          </w:tcPr>
-          <w:p>
-            <w:pPr>
-              <w:spacing w:after="0"/>
-            </w:pPr>
-          </w:p>
-        </w:tc>
-      </w:tr>
     </w:tbl>
     <w:p>
       <w:pPr>
@@ -12672,28 +11506,6 @@
           </w:p>
         </w:tc>
       </w:tr>
-      <w:tr>
-        <w:trPr>
-          <w:cantSplit/>
-          <w:trHeight w:val="400" w:hRule="exact"/>
-        </w:trPr>
-        <w:tc>
-          <w:tcPr>
-            <w:tcW w:type="dxa" w:w="9098"/>
-            <w:tcBorders>
-              <w:top w:val="none" w:color="FFFFFF" w:sz="0"/>
-              <w:left w:val="none" w:color="FFFFFF" w:sz="0"/>
-              <w:bottom w:val="single" w:color="C9C5BC" w:sz="4"/>
-              <w:right w:val="none" w:color="FFFFFF" w:sz="0"/>
-            </w:tcBorders>
-          </w:tcPr>
-          <w:p>
-            <w:pPr>
-              <w:spacing w:after="0"/>
-            </w:pPr>
-          </w:p>
-        </w:tc>
-      </w:tr>
     </w:tbl>
     <w:p>
       <w:pPr>
@@ -12783,28 +11595,6 @@
           </w:p>
         </w:tc>
       </w:tr>
-      <w:tr>
-        <w:trPr>
-          <w:cantSplit/>
-          <w:trHeight w:val="400" w:hRule="exact"/>
-        </w:trPr>
-        <w:tc>
-          <w:tcPr>
-            <w:tcW w:type="dxa" w:w="9098"/>
-            <w:tcBorders>
-              <w:top w:val="none" w:color="FFFFFF" w:sz="0"/>
-              <w:left w:val="none" w:color="FFFFFF" w:sz="0"/>
-              <w:bottom w:val="single" w:color="C9C5BC" w:sz="4"/>
-              <w:right w:val="none" w:color="FFFFFF" w:sz="0"/>
-            </w:tcBorders>
-          </w:tcPr>
-          <w:p>
-            <w:pPr>
-              <w:spacing w:after="0"/>
-            </w:pPr>
-          </w:p>
-        </w:tc>
-      </w:tr>
     </w:tbl>
     <w:p>
       <w:pPr>
@@ -12894,28 +11684,6 @@
           </w:p>
         </w:tc>
       </w:tr>
-      <w:tr>
-        <w:trPr>
-          <w:cantSplit/>
-          <w:trHeight w:val="400" w:hRule="exact"/>
-        </w:trPr>
-        <w:tc>
-          <w:tcPr>
-            <w:tcW w:type="dxa" w:w="9098"/>
-            <w:tcBorders>
-              <w:top w:val="none" w:color="FFFFFF" w:sz="0"/>
-              <w:left w:val="none" w:color="FFFFFF" w:sz="0"/>
-              <w:bottom w:val="single" w:color="C9C5BC" w:sz="4"/>
-              <w:right w:val="none" w:color="FFFFFF" w:sz="0"/>
-            </w:tcBorders>
-          </w:tcPr>
-          <w:p>
-            <w:pPr>
-              <w:spacing w:after="0"/>
-            </w:pPr>
-          </w:p>
-        </w:tc>
-      </w:tr>
     </w:tbl>
     <w:p>
       <w:pPr>
@@ -13005,28 +11773,6 @@
           </w:p>
         </w:tc>
       </w:tr>
-      <w:tr>
-        <w:trPr>
-          <w:cantSplit/>
-          <w:trHeight w:val="400" w:hRule="exact"/>
-        </w:trPr>
-        <w:tc>
-          <w:tcPr>
-            <w:tcW w:type="dxa" w:w="9098"/>
-            <w:tcBorders>
-              <w:top w:val="none" w:color="FFFFFF" w:sz="0"/>
-              <w:left w:val="none" w:color="FFFFFF" w:sz="0"/>
-              <w:bottom w:val="single" w:color="C9C5BC" w:sz="4"/>
-              <w:right w:val="none" w:color="FFFFFF" w:sz="0"/>
-            </w:tcBorders>
-          </w:tcPr>
-          <w:p>
-            <w:pPr>
-              <w:spacing w:after="0"/>
-            </w:pPr>
-          </w:p>
-        </w:tc>
-      </w:tr>
     </w:tbl>
     <w:p>
       <w:pPr>
@@ -13116,28 +11862,6 @@
           </w:p>
         </w:tc>
       </w:tr>
-      <w:tr>
-        <w:trPr>
-          <w:cantSplit/>
-          <w:trHeight w:val="400" w:hRule="exact"/>
-        </w:trPr>
-        <w:tc>
-          <w:tcPr>
-            <w:tcW w:type="dxa" w:w="9098"/>
-            <w:tcBorders>
-              <w:top w:val="none" w:color="FFFFFF" w:sz="0"/>
-              <w:left w:val="none" w:color="FFFFFF" w:sz="0"/>
-              <w:bottom w:val="single" w:color="C9C5BC" w:sz="4"/>
-              <w:right w:val="none" w:color="FFFFFF" w:sz="0"/>
-            </w:tcBorders>
-          </w:tcPr>
-          <w:p>
-            <w:pPr>
-              <w:spacing w:after="0"/>
-            </w:pPr>
-          </w:p>
-        </w:tc>
-      </w:tr>
     </w:tbl>
     <w:p>
       <w:pPr>
@@ -13670,28 +12394,6 @@
           </w:p>
         </w:tc>
       </w:tr>
-      <w:tr>
-        <w:trPr>
-          <w:cantSplit/>
-          <w:trHeight w:val="400" w:hRule="exact"/>
-        </w:trPr>
-        <w:tc>
-          <w:tcPr>
-            <w:tcW w:type="dxa" w:w="9098"/>
-            <w:tcBorders>
-              <w:top w:val="none" w:color="FFFFFF" w:sz="0"/>
-              <w:left w:val="none" w:color="FFFFFF" w:sz="0"/>
-              <w:bottom w:val="single" w:color="C9C5BC" w:sz="4"/>
-              <w:right w:val="none" w:color="FFFFFF" w:sz="0"/>
-            </w:tcBorders>
-          </w:tcPr>
-          <w:p>
-            <w:pPr>
-              <w:spacing w:after="0"/>
-            </w:pPr>
-          </w:p>
-        </w:tc>
-      </w:tr>
     </w:tbl>
     <w:p>
       <w:pPr>
@@ -13781,28 +12483,6 @@
           </w:p>
         </w:tc>
       </w:tr>
-      <w:tr>
-        <w:trPr>
-          <w:cantSplit/>
-          <w:trHeight w:val="400" w:hRule="exact"/>
-        </w:trPr>
-        <w:tc>
-          <w:tcPr>
-            <w:tcW w:type="dxa" w:w="9098"/>
-            <w:tcBorders>
-              <w:top w:val="none" w:color="FFFFFF" w:sz="0"/>
-              <w:left w:val="none" w:color="FFFFFF" w:sz="0"/>
-              <w:bottom w:val="single" w:color="C9C5BC" w:sz="4"/>
-              <w:right w:val="none" w:color="FFFFFF" w:sz="0"/>
-            </w:tcBorders>
-          </w:tcPr>
-          <w:p>
-            <w:pPr>
-              <w:spacing w:after="0"/>
-            </w:pPr>
-          </w:p>
-        </w:tc>
-      </w:tr>
     </w:tbl>
     <w:p>
       <w:pPr>
@@ -13892,28 +12572,6 @@
           </w:p>
         </w:tc>
       </w:tr>
-      <w:tr>
-        <w:trPr>
-          <w:cantSplit/>
-          <w:trHeight w:val="400" w:hRule="exact"/>
-        </w:trPr>
-        <w:tc>
-          <w:tcPr>
-            <w:tcW w:type="dxa" w:w="9098"/>
-            <w:tcBorders>
-              <w:top w:val="none" w:color="FFFFFF" w:sz="0"/>
-              <w:left w:val="none" w:color="FFFFFF" w:sz="0"/>
-              <w:bottom w:val="single" w:color="C9C5BC" w:sz="4"/>
-              <w:right w:val="none" w:color="FFFFFF" w:sz="0"/>
-            </w:tcBorders>
-          </w:tcPr>
-          <w:p>
-            <w:pPr>
-              <w:spacing w:after="0"/>
-            </w:pPr>
-          </w:p>
-        </w:tc>
-      </w:tr>
     </w:tbl>
     <w:p>
       <w:pPr>
@@ -14003,28 +12661,6 @@
           </w:p>
         </w:tc>
       </w:tr>
-      <w:tr>
-        <w:trPr>
-          <w:cantSplit/>
-          <w:trHeight w:val="400" w:hRule="exact"/>
-        </w:trPr>
-        <w:tc>
-          <w:tcPr>
-            <w:tcW w:type="dxa" w:w="9098"/>
-            <w:tcBorders>
-              <w:top w:val="none" w:color="FFFFFF" w:sz="0"/>
-              <w:left w:val="none" w:color="FFFFFF" w:sz="0"/>
-              <w:bottom w:val="single" w:color="C9C5BC" w:sz="4"/>
-              <w:right w:val="none" w:color="FFFFFF" w:sz="0"/>
-            </w:tcBorders>
-          </w:tcPr>
-          <w:p>
-            <w:pPr>
-              <w:spacing w:after="0"/>
-            </w:pPr>
-          </w:p>
-        </w:tc>
-      </w:tr>
     </w:tbl>
     <w:p>
       <w:pPr>
@@ -14114,28 +12750,6 @@
           </w:p>
         </w:tc>
       </w:tr>
-      <w:tr>
-        <w:trPr>
-          <w:cantSplit/>
-          <w:trHeight w:val="400" w:hRule="exact"/>
-        </w:trPr>
-        <w:tc>
-          <w:tcPr>
-            <w:tcW w:type="dxa" w:w="9098"/>
-            <w:tcBorders>
-              <w:top w:val="none" w:color="FFFFFF" w:sz="0"/>
-              <w:left w:val="none" w:color="FFFFFF" w:sz="0"/>
-              <w:bottom w:val="single" w:color="C9C5BC" w:sz="4"/>
-              <w:right w:val="none" w:color="FFFFFF" w:sz="0"/>
-            </w:tcBorders>
-          </w:tcPr>
-          <w:p>
-            <w:pPr>
-              <w:spacing w:after="0"/>
-            </w:pPr>
-          </w:p>
-        </w:tc>
-      </w:tr>
     </w:tbl>
     <w:p>
       <w:pPr>
@@ -14225,28 +12839,6 @@
           </w:p>
         </w:tc>
       </w:tr>
-      <w:tr>
-        <w:trPr>
-          <w:cantSplit/>
-          <w:trHeight w:val="400" w:hRule="exact"/>
-        </w:trPr>
-        <w:tc>
-          <w:tcPr>
-            <w:tcW w:type="dxa" w:w="9098"/>
-            <w:tcBorders>
-              <w:top w:val="none" w:color="FFFFFF" w:sz="0"/>
-              <w:left w:val="none" w:color="FFFFFF" w:sz="0"/>
-              <w:bottom w:val="single" w:color="C9C5BC" w:sz="4"/>
-              <w:right w:val="none" w:color="FFFFFF" w:sz="0"/>
-            </w:tcBorders>
-          </w:tcPr>
-          <w:p>
-            <w:pPr>
-              <w:spacing w:after="0"/>
-            </w:pPr>
-          </w:p>
-        </w:tc>
-      </w:tr>
     </w:tbl>
     <w:p>
       <w:pPr>
@@ -14753,28 +13345,6 @@
           </w:p>
         </w:tc>
       </w:tr>
-      <w:tr>
-        <w:trPr>
-          <w:cantSplit/>
-          <w:trHeight w:val="400" w:hRule="exact"/>
-        </w:trPr>
-        <w:tc>
-          <w:tcPr>
-            <w:tcW w:type="dxa" w:w="9098"/>
-            <w:tcBorders>
-              <w:top w:val="none" w:color="FFFFFF" w:sz="0"/>
-              <w:left w:val="none" w:color="FFFFFF" w:sz="0"/>
-              <w:bottom w:val="single" w:color="C9C5BC" w:sz="4"/>
-              <w:right w:val="none" w:color="FFFFFF" w:sz="0"/>
-            </w:tcBorders>
-          </w:tcPr>
-          <w:p>
-            <w:pPr>
-              <w:spacing w:after="0"/>
-            </w:pPr>
-          </w:p>
-        </w:tc>
-      </w:tr>
     </w:tbl>
     <w:p>
       <w:pPr>
@@ -14864,28 +13434,6 @@
           </w:p>
         </w:tc>
       </w:tr>
-      <w:tr>
-        <w:trPr>
-          <w:cantSplit/>
-          <w:trHeight w:val="400" w:hRule="exact"/>
-        </w:trPr>
-        <w:tc>
-          <w:tcPr>
-            <w:tcW w:type="dxa" w:w="9098"/>
-            <w:tcBorders>
-              <w:top w:val="none" w:color="FFFFFF" w:sz="0"/>
-              <w:left w:val="none" w:color="FFFFFF" w:sz="0"/>
-              <w:bottom w:val="single" w:color="C9C5BC" w:sz="4"/>
-              <w:right w:val="none" w:color="FFFFFF" w:sz="0"/>
-            </w:tcBorders>
-          </w:tcPr>
-          <w:p>
-            <w:pPr>
-              <w:spacing w:after="0"/>
-            </w:pPr>
-          </w:p>
-        </w:tc>
-      </w:tr>
     </w:tbl>
     <w:p>
       <w:pPr>
@@ -14975,28 +13523,6 @@
           </w:p>
         </w:tc>
       </w:tr>
-      <w:tr>
-        <w:trPr>
-          <w:cantSplit/>
-          <w:trHeight w:val="400" w:hRule="exact"/>
-        </w:trPr>
-        <w:tc>
-          <w:tcPr>
-            <w:tcW w:type="dxa" w:w="9098"/>
-            <w:tcBorders>
-              <w:top w:val="none" w:color="FFFFFF" w:sz="0"/>
-              <w:left w:val="none" w:color="FFFFFF" w:sz="0"/>
-              <w:bottom w:val="single" w:color="C9C5BC" w:sz="4"/>
-              <w:right w:val="none" w:color="FFFFFF" w:sz="0"/>
-            </w:tcBorders>
-          </w:tcPr>
-          <w:p>
-            <w:pPr>
-              <w:spacing w:after="0"/>
-            </w:pPr>
-          </w:p>
-        </w:tc>
-      </w:tr>
     </w:tbl>
     <w:p>
       <w:pPr>
@@ -15086,28 +13612,6 @@
           </w:p>
         </w:tc>
       </w:tr>
-      <w:tr>
-        <w:trPr>
-          <w:cantSplit/>
-          <w:trHeight w:val="400" w:hRule="exact"/>
-        </w:trPr>
-        <w:tc>
-          <w:tcPr>
-            <w:tcW w:type="dxa" w:w="9098"/>
-            <w:tcBorders>
-              <w:top w:val="none" w:color="FFFFFF" w:sz="0"/>
-              <w:left w:val="none" w:color="FFFFFF" w:sz="0"/>
-              <w:bottom w:val="single" w:color="C9C5BC" w:sz="4"/>
-              <w:right w:val="none" w:color="FFFFFF" w:sz="0"/>
-            </w:tcBorders>
-          </w:tcPr>
-          <w:p>
-            <w:pPr>
-              <w:spacing w:after="0"/>
-            </w:pPr>
-          </w:p>
-        </w:tc>
-      </w:tr>
     </w:tbl>
     <w:p>
       <w:pPr>
@@ -15197,28 +13701,6 @@
           </w:p>
         </w:tc>
       </w:tr>
-      <w:tr>
-        <w:trPr>
-          <w:cantSplit/>
-          <w:trHeight w:val="400" w:hRule="exact"/>
-        </w:trPr>
-        <w:tc>
-          <w:tcPr>
-            <w:tcW w:type="dxa" w:w="9098"/>
-            <w:tcBorders>
-              <w:top w:val="none" w:color="FFFFFF" w:sz="0"/>
-              <w:left w:val="none" w:color="FFFFFF" w:sz="0"/>
-              <w:bottom w:val="single" w:color="C9C5BC" w:sz="4"/>
-              <w:right w:val="none" w:color="FFFFFF" w:sz="0"/>
-            </w:tcBorders>
-          </w:tcPr>
-          <w:p>
-            <w:pPr>
-              <w:spacing w:after="0"/>
-            </w:pPr>
-          </w:p>
-        </w:tc>
-      </w:tr>
     </w:tbl>
     <w:p>
       <w:pPr>
@@ -15264,28 +13746,6 @@
       <w:tblGrid>
         <w:gridCol w:w="9098"/>
       </w:tblGrid>
-      <w:tr>
-        <w:trPr>
-          <w:cantSplit/>
-          <w:trHeight w:val="400" w:hRule="exact"/>
-        </w:trPr>
-        <w:tc>
-          <w:tcPr>
-            <w:tcW w:type="dxa" w:w="9098"/>
-            <w:tcBorders>
-              <w:top w:val="none" w:color="FFFFFF" w:sz="0"/>
-              <w:left w:val="none" w:color="FFFFFF" w:sz="0"/>
-              <w:bottom w:val="single" w:color="C9C5BC" w:sz="4"/>
-              <w:right w:val="none" w:color="FFFFFF" w:sz="0"/>
-            </w:tcBorders>
-          </w:tcPr>
-          <w:p>
-            <w:pPr>
-              <w:spacing w:after="0"/>
-            </w:pPr>
-          </w:p>
-        </w:tc>
-      </w:tr>
       <w:tr>
         <w:trPr>
           <w:cantSplit/>

</xml_diff>